<commit_message>
Proliferative population in each primary cell line: markers, Wolbachia, origin
</commit_message>
<xml_diff>
--- a/Lum2027_preliminary_results_v2.docx
+++ b/Lum2027_preliminary_results_v2.docx
@@ -72,6 +72,20 @@
           <w:szCs w:val="18"/>
         </w:rPr>
         <w:t xml:space="preserve">Infection status: ubkhc and Dsim-Merrill23 derive from infected lineages and lost their infections in culture; both Dsim6B lines derive from wRi-infected D. simulans w− flies, and the uninfected Dsim6B line was cured with doxycycline. I rewrote the titer section and the Wolbachia paragraphs of the Discussion to match, and removed the natural-versus-transinfected hypothesis.</w:t>
+      </w:r>
+    </w:p>
+    <w:p>
+      <w:pPr>
+        <w:shd w:fill="FFF4D6" w:color="auto" w:val="clear"/>
+        <w:spacing w:after="60"/>
+      </w:pPr>
+      <w:r>
+        <w:rPr>
+          <w:rFonts w:ascii="Arial" w:cs="Arial" w:eastAsia="Arial" w:hAnsi="Arial"/>
+          <w:sz w:val="18"/>
+          <w:szCs w:val="18"/>
+        </w:rPr>
+        <w:t xml:space="preserve">Statistics (this revision): new tests are in bold. Tests I ran on the existing result tables: Shannon diversity, pseudobulk grouping, parental-embryo rank, tissue specificity (new atlas_stats.py), marker-state composition (paired t-test on lineage logits), Polycomb trend, and titer summaries. Two draft claims did not survive testing and are rewritten: cell lines are not less diverse than embryos (p = 0.56), and cell lines do not lack a tissue peak; they correlate less with every tissue. Pending your cluster rerun (values marked [pending]): GO enrichment of unmarked switched-off genes, the rank test with 2,000 permutations and BH-adjusted p-values, and the atlas_stats and composition_tests output files.</w:t>
       </w:r>
     </w:p>
     <w:p>
@@ -269,8 +283,16 @@
       <w:r>
         <w:rPr>
           <w:rFonts w:ascii="Arial" w:cs="Arial" w:eastAsia="Arial" w:hAnsi="Arial"/>
-        </w:rPr>
-        <w:t xml:space="preserve">The reduction in diversity was more pronounced at the coarser germ-layer resolution (mean H′ = 1.18 for cell lines versus 1.40 for embryos), consistent with cell lines collapsing onto a small number of transcriptional states rather than merely sub-sampling the same diversity present in the parental embryo. This convergence was independent of genetic background and Wolbachia </w:t>
+          <w:b/>
+          <w:bCs/>
+        </w:rPr>
+        <w:t xml:space="preserve">Shannon diversity, however, did not differ between embryo and cell-line conditions at either the atlas-annotation (mean H′ 2.26 versus 2.08) or germ-layer resolution (1.40 versus 1.18; exact Mann–Whitney p = 0.56 for both; Table S9), so cell lines converge on the same identities rather than on fewer identities.</w:t>
+      </w:r>
+      <w:r>
+        <w:rPr>
+          <w:rFonts w:ascii="Arial" w:cs="Arial" w:eastAsia="Arial" w:hAnsi="Arial"/>
+        </w:rPr>
+        <w:t xml:space="preserve"> This convergence was independent of genetic background and Wolbachia </w:t>
       </w:r>
       <w:r>
         <w:rPr>
@@ -306,7 +328,7 @@
           <w:b/>
           <w:bCs/>
         </w:rPr>
-        <w:t xml:space="preserve">Marker-based scoring (below) supports the hemolymph-like identity but not the CNS-like label: neural marker states made up at most 3.3% of cell-line cells, which suggests that proliferative cell-line cells project onto the atlas CNS population by nearest-neighbor similarity rather than by neural identity.</w:t>
+        <w:t xml:space="preserve">Marker-based scoring (below) does not support the CNS-like label: neural marker states made up at most 3.3% of cell-line cells, which suggests that proliferative cell-line cells project onto the atlas CNS population by nearest-neighbor similarity rather than by neural identity.</w:t>
       </w:r>
     </w:p>
     <w:p>
@@ -389,7 +411,35 @@
         <w:rPr>
           <w:rFonts w:ascii="Arial" w:cs="Arial" w:eastAsia="Arial" w:hAnsi="Arial"/>
         </w:rPr>
-        <w:t xml:space="preserve">Hierarchical clustering of pairwise pseudobulk correlations across all nine conditions produced a top-level split that separated all four embryo conditions from all five cell-line conditions; genetic background and Wolbachia strain structured only the sub-clusters within each group (Figure 3A). The mean pairwise Spearman correlation was 0.835 among cell lines and 0.825 among embryos, compared with 0.705 between a cell line and any embryo condition, regardless of species or Wolbachia strain. Notably, a cell line's pseudobulk profile did not correlate most strongly with that of its own parental embryo: Dsim6B, for example, correlated more strongly with Dsim-Merrill23-wRi-embryos (ρ = 0.840) than with its own parental Dsim-w-wRi-embryos (ρ = 0.785). Culture status was therefore a stronger determinant of pseudobulk transcriptome similarity than either species or the specific embryo from which a </w:t>
+        <w:t xml:space="preserve">Hierarchical clustering of pairwise pseudobulk correlations across all nine conditions produced a top-level split that separated all four embryo conditions from all five cell-line conditions; genetic background and Wolbachia strain structured only the sub-clusters within each group (Figure 3A). The mean pairwise Spearman correlation was 0.835 among cell lines and 0.825 among embryos, compared with 0.705 between a cell line and any embryo condition, regardless of species or Wolbachia strain </w:t>
+      </w:r>
+      <w:r>
+        <w:rPr>
+          <w:rFonts w:ascii="Arial" w:cs="Arial" w:eastAsia="Arial" w:hAnsi="Arial"/>
+          <w:b/>
+          <w:bCs/>
+        </w:rPr>
+        <w:t xml:space="preserve">(permutation test over all 126 embryo/cell-line relabelings of the nine conditions, p = 0.008, the smallest attainable)</w:t>
+      </w:r>
+      <w:r>
+        <w:rPr>
+          <w:rFonts w:ascii="Arial" w:cs="Arial" w:eastAsia="Arial" w:hAnsi="Arial"/>
+        </w:rPr>
+        <w:t xml:space="preserve">. Notably, a cell line's pseudobulk profile did not correlate most strongly with that of its own parental embryo: Dsim6B, for example, correlated more strongly with Dsim-Merrill23-wRi-embryos (ρ = 0.840) than with its own parental Dsim-w-wRi-embryos (ρ = 0.785). </w:t>
+      </w:r>
+      <w:r>
+        <w:rPr>
+          <w:rFonts w:ascii="Arial" w:cs="Arial" w:eastAsia="Arial" w:hAnsi="Arial"/>
+          <w:b/>
+          <w:bCs/>
+        </w:rPr>
+        <w:t xml:space="preserve">Only JW18wMel and Dsim-Merrill23 correlated best with their own parental embryo; Dsim6B and Dsim6B-wMel ranked theirs second and ubkhc third of four (Table S10).</w:t>
+      </w:r>
+      <w:r>
+        <w:rPr>
+          <w:rFonts w:ascii="Arial" w:cs="Arial" w:eastAsia="Arial" w:hAnsi="Arial"/>
+        </w:rPr>
+        <w:t xml:space="preserve"> Culture status was therefore a stronger determinant of pseudobulk transcriptome similarity than either species or the specific embryo from which a </w:t>
       </w:r>
       <w:r>
         <w:rPr>
@@ -425,7 +475,15 @@
         <w:rPr>
           <w:rFonts w:ascii="Arial" w:cs="Arial" w:eastAsia="Arial" w:hAnsi="Arial"/>
         </w:rPr>
-        <w:t xml:space="preserve">Correlating each condition's pseudobulk profile against reference pseudobulk profiles for each atlas tissue (computed from embryo cells only) showed that embryo conditions peaked sharply at the tissue matching their dominant annotation, Dsim-Merrill23-wRi-embryos against foregut (ρ = 0.99) and JupiterGFP-wMel-embryos against fat body (ρ = 0.98), for example, whereas cell-line conditions showed uniformly moderate correlations (ρ = 0.57–0.85) with no clear peak against any single reference tissue (Figure 3B). This pattern corroborates the composition analysis above at the pseudobulk level: embryo transcriptomes are recognizably tissue-specific, whereas cell-line transcriptomes resemble a blend that does not closely match any single reference tissue.</w:t>
+        <w:t xml:space="preserve">Correlating each condition's pseudobulk profile against reference pseudobulk profiles for each atlas tissue (computed from embryo cells only) showed that embryo conditions correlated closely with the tissue matching their dominant annotation, Dsim-Merrill23-wRi-embryos against foregut (ρ = 0.99) and JupiterGFP-wMel-embryos against fat body (ρ = 0.98), for example, whereas cell-line conditions showed uniformly moderate correlations (ρ = 0.57–0.85; Figure 3B). </w:t>
+      </w:r>
+      <w:r>
+        <w:rPr>
+          <w:rFonts w:ascii="Arial" w:cs="Arial" w:eastAsia="Arial" w:hAnsi="Arial"/>
+          <w:b/>
+          <w:bCs/>
+        </w:rPr>
+        <w:t xml:space="preserve">Embryo conditions correlated more strongly than cell lines with their best-matching tissue (mean top ρ 0.97 versus 0.79; exact Mann–Whitney p = 0.016, the smallest attainable for four versus five conditions), but the margin over the second-best tissue did not differ (0.021 versus 0.013; p = 0.41; Table S9). Cell-line transcriptomes therefore resemble every embryonic tissue less, rather than lacking a single best-matching tissue.</w:t>
       </w:r>
     </w:p>
     <w:p>
@@ -538,7 +596,21 @@
           <w:b/>
           <w:bCs/>
         </w:rPr>
-        <w:t xml:space="preserve">The embryo-to-primary-cell-line transition changed 4,484 genes (2,125 up and 2,359 down in primary cell lines; adjusted p &lt; 0.05), and the primary-to-cell-line transition changed 3,720 genes (287 up and 3,433 down in cell lines). All four lineages agreed in direction for 81% and 84% of these genes, respectively, and a species-by-stage interaction affected only 195 genes in the primary-to-cell-line step. Primary cell lines were sequenced more deeply than embryos or cell lines, so we repeated the analysis after downsampling every cell to 2,000 UMIs; this retained 89–97% of significant genes per contrast, with log2 fold-change correlations of at least 0.99, so sequencing depth did not drive these differences.</w:t>
+        <w:t xml:space="preserve">The embryo-to-primary-cell-line transition changed 4,484 genes (2,125 up and 2,359 down in primary cell lines; adjusted p &lt; 0.05), and the primary-to-cell-line transition changed 3,720 genes (287 up and 3,433 down in cell lines). All four lineages agreed in direction for 81% and 84% of these genes, respectively </w:t>
+      </w:r>
+      <w:r>
+        <w:rPr>
+          <w:rFonts w:ascii="Arial" w:cs="Arial" w:eastAsia="Arial" w:hAnsi="Arial"/>
+        </w:rPr>
+        <w:t xml:space="preserve">(12.5% expected by chance; binomial p &lt; 10⁻¹⁰⁰ for both)</w:t>
+      </w:r>
+      <w:r>
+        <w:rPr>
+          <w:rFonts w:ascii="Arial" w:cs="Arial" w:eastAsia="Arial" w:hAnsi="Arial"/>
+          <w:b/>
+          <w:bCs/>
+        </w:rPr>
+        <w:t xml:space="preserve">, and a species-by-stage interaction affected only 195 genes in the primary-to-cell-line step. Primary cell lines were sequenced more deeply than embryos or cell lines, so we repeated the analysis after downsampling every cell to 2,000 UMIs; this retained 89–97% of significant genes per contrast, with log2 fold-change correlations of at least 0.99, so sequencing depth did not drive these differences.</w:t>
       </w:r>
     </w:p>
     <w:p>
@@ -551,7 +623,7 @@
           <w:b/>
           <w:bCs/>
         </w:rPr>
-        <w:t xml:space="preserve">Gene set enrichment analysis separated the two transitions (Figure 5B). Relative to embryos, primary cell lines up-regulated proteasome, endosomal transport, DNA repair, and Toll and Imd signaling genes and down-regulated translation and developmental programs (axon guidance, nervous system, eye, and imaginal disc development). Relative to primary cell lines, cell lines up-regulated peptide biosynthesis, ribosome biogenesis, DNA replication, and mitosis (normalized enrichment scores 3.0–5.5; FDR &lt; 0.05) and down-regulated antibacterial defense and differentiation terms (neuroblast differentiation, muscle cell fate commitment, stem cell development).</w:t>
+        <w:t xml:space="preserve">Gene set enrichment analysis separated the two transitions (Figure 5B). Relative to embryos, primary cell lines up-regulated proteasome, endosomal transport, DNA repair, and Toll and Imd signaling genes (normalized enrichment scores 2.2–2.6; FDR ≤ 0.003) and down-regulated translation and developmental programs (axon guidance, nervous system, eye, and imaginal disc development; NES −2.4 to −3.1; FDR &lt; 0.001). Relative to primary cell lines, cell lines up-regulated peptide biosynthesis, ribosome biogenesis, DNA replication, and mitotic spindle organization (NES 3.7–5.5; FDR &lt; 0.001) and down-regulated antibacterial defense and differentiation terms (defense response to Gram-positive bacteria, neuroblast differentiation, muscle cell fate commitment, stem cell development; NES −1.8 to −1.9; FDR 0.007–0.035; Table S3).</w:t>
       </w:r>
     </w:p>
     <w:p>
@@ -673,7 +745,7 @@
           <w:b/>
           <w:bCs/>
         </w:rPr>
-        <w:t xml:space="preserve">Marker-based cell states reveal a proliferative, plasmatocyte-like cell-line identity</w:t>
+        <w:t xml:space="preserve">Marker-based cell states show that cell lines are proliferative and lack the injury program of primary cell lines</w:t>
       </w:r>
     </w:p>
     <w:p>
@@ -686,7 +758,7 @@
           <w:b/>
           <w:bCs/>
         </w:rPr>
-        <w:t xml:space="preserve">Because the atlas labels come from intact embryos, we also scored every cell for curated marker modules (plasmatocyte, crystal cell, lamellocyte, fat body, neural, neuroblast, muscle, epidermis, germline, proliferation, and antimicrobial peptides; Figure 6). Proliferating cells made up 0.5–6.2% of embryo cells and 0.1–10.5% of cells in primary cell lines but 27–66% of cell-line cells. An antimicrobial-peptide program marked 17–69% of cells in primary cell lines and was absent from embryos and cell lines, which suggests that dissociation and culture trigger an injury or immune response that established cell lines no longer carry. Plasmatocyte-like cells made up 62% of ubkhc, 35% of Dsim-Merrill23, and 32% of the Dsim_w cell lines, whereas JW18wMel was 54% unassigned and 25% neuroblast-like. Crystal-cell states, present in 12–13% of cells in primary cell lines, fell to 0–1.4% in cell lines.</w:t>
+        <w:t xml:space="preserve">Because the atlas labels come from intact embryos, we also scored every cell for curated marker modules (plasmatocyte, crystal cell, lamellocyte, fat body, neural, neuroblast, muscle, epidermis, germline, proliferation, and antimicrobial peptides; Figure 6). We tested each stage transition with lineages as replicates (paired t-test on the per-lineage log odds of each state, n = 4; BH-adjusted across 24 tests; Table S4). Proliferating cells made up 0.5–6.2% of embryo cells and 0.1–10.5% of cells in primary cell lines but 27–66% of cell-line cells (mean log odds ratio 3.6 for cell line versus primary cell line; p = 0.044, adjusted p = 0.08). An antimicrobial-peptide program marked 17–69% of cells in primary cell lines and was absent from embryos and cell lines (p = 0.004 and 0.003; adjusted p = 0.019 for both), which suggests that dissociation and culture trigger an injury or immune response that established cell lines no longer carry. Fat-body-like states followed the same pattern (0% in embryos, 16–33% in primary cell lines, ≤0.6% in cell lines; adjusted p = 0.019 and 0.046). Crystal-cell states, present in 12–13% of cells in primary cell lines, fell to 0–1.4% in cell lines (p = 0.043; adjusted p = 0.08). Plasmatocyte-like states rose from 0–2.7% in embryos to 4–16% in primary cell lines (adjusted p = 0.019) and reached 62% of ubkhc, 35% of Dsim-Merrill23, and 32% of the Dsim_w cell lines, but JW18wMel was only 4% plasmatocyte-like (54% unassigned, 25% neuroblast-like), so the cell-line versus primary-cell-line difference was not significant (p = 0.23). With four lineages, these tests have limited power; the directions were consistent in every lineage for proliferation, the antimicrobial-peptide program, and crystal-cell states.</w:t>
       </w:r>
     </w:p>
     <w:p>
@@ -775,7 +847,7 @@
           <w:b/>
           <w:bCs/>
         </w:rPr>
-        <w:t xml:space="preserve">To ask whether any primary-cell-line subpopulation resembles the cell lines, we compared the most proliferative 5% of cells in each primary cell line with the remaining cells and correlated their per-gene expression shift with the pseudobulk log2 fold change between cell lines and primary cell lines (Spearman ρ), using only genes outside the highly variable set. We compared each ρ with 200 random equal-sized sets of cells from the same primary cell line and, separately, with random sets matched on per-cell sequencing depth. Proliferative cells shifted toward the cell line in both D. melanogaster lineages and in Dsim_w (ρ = 0.25–0.32; permutation p ≤ 0.01; Figure 7). The shift persisted after we removed 415–476 cell-cycle, ribosome-biogenesis, translation, and chromatin genes (ρ = 0.24–0.31) and after we also removed mitochondrial and respiration genes (ρ = 0.25–0.32), and it exceeded depth-matched random sets in all three lineages. In Dsim-Merrill23, proliferative cells did not shift toward the cell line (ρ = −0.11), although they exceeded depth-matched sets. Cells with the lowest antimicrobial-peptide scores did not shift toward the cell line (ρ = −0.13 to 0.16), so reduced injury signaling alone does not explain the effect. Cells selected for global similarity to the cell-line centroid had low sequencing depth (median UMIs 0.34–0.81 times the rest of the primary cell line) and shifted away from the cell line, a depth artifact; we therefore do not treat them as precursors.</w:t>
+        <w:t xml:space="preserve">To ask whether any primary-cell-line subpopulation resembles the cell lines, we compared the most proliferative 5% of cells in each primary cell line with the remaining cells and correlated their per-gene expression shift with the pseudobulk log2 fold change between cell lines and primary cell lines (Spearman ρ), using only genes outside the highly variable set. We compared each ρ with 200 random equal-sized sets of cells from the same primary cell line and, separately, with random sets matched on per-cell sequencing depth. Proliferative cells shifted toward the cell line in both D. melanogaster lineages and in Dsim_w (ρ = 0.25–0.32; permutation p ≤ 0.005, the smallest attainable with 200 permutations; Figure 7; Table S5). The shift persisted after we removed 415–476 cell-cycle, ribosome-biogenesis, translation, and chromatin genes (ρ = 0.24–0.31) and after we also removed mitochondrial and respiration genes (ρ = 0.25–0.32; p ≤ 0.01 for all), and it exceeded depth-matched random sets in all three lineages (p ≤ 0.005). In Dsim-Merrill23, proliferative cells did not shift toward the cell line (ρ = −0.11; p = 0.70), although they exceeded depth-matched sets (p ≤ 0.005). [pending: p-values from the 2,000-permutation rerun, BH-adjusted across all rank tests] Cells with the lowest antimicrobial-peptide scores did not shift toward the cell line (ρ = −0.13 to 0.16), so reduced injury signaling alone does not explain the effect. Cells selected for global similarity to the cell-line centroid had low sequencing depth (median UMIs 0.34–0.81 times the rest of the primary cell line) and shifted away from the cell line, a depth artifact; we therefore do not treat them as precursors.</w:t>
       </w:r>
     </w:p>
     <w:p>
@@ -864,7 +936,21 @@
           <w:b/>
           <w:bCs/>
         </w:rPr>
-        <w:t xml:space="preserve">Of the genes expressed in every primary cell line (log2 CPM ≥ 3), 166 were absent (log2 CPM &lt; 1) from every cell line, whereas no gene showed the reverse pattern, and only 46 genes rose consistently in all four lineages (Table 1). The cell lines silenced the Hox genes lab, Dfd, Scr, Antp, Ubx, abd-A, and Abd-B (for example, Antp log2 fold change −8.4, Ubx −8.3, abd-A −8.7) and homothorax (−7.4), together with positional and lineage transcription factors (sna, wor, ase, pros, esg, Dll, ey, cas, gcm, and svp, −10.3). They lost the crystal-cell program (lz −8.5, PPO1 −12.2, PPO2 −11.0), paracrine ligands (dpp −4.0, Actβ −6.8, Ilp6 −2.8, wg, upd1, vn), and ecdysone-response genes (Hr3 −4.3, ImpL1 −5.8, E93 −3.9) while retaining EcR. They also silenced the pro-apoptotic genes grim (−6.4) and sickle (−6.1) and the Bcl-2 family gene Buffy (−3.1). The consistently gained genes were mostly mitotic regulators (stg +2.0, CycB +1.3, Incenp, BubR1), while the endocycle switch fzr decreased (−2.1).</w:t>
+        <w:t xml:space="preserve">Of the genes expressed in every primary cell line (log2 CPM ≥ 3), 166 were absent (log2 CPM &lt; 1) from every cell line, whereas no gene showed the reverse pattern, and only 46 genes rose consistently in all four lineages (Table 1). The cell lines silenced the Hox genes lab, Dfd, Scr, Antp, Ubx, abd-A, and Abd-B (for example, Antp log2 fold change −8.4, Ubx −8.3, abd-A −8.7) and homothorax (−7.4), together with positional and lineage transcription factors (sna, wor, ase, pros, esg, Dll, ey, cas, gcm, and svp, −10.3). They lost the crystal-cell program (lz −8.5, PPO1 −12.2, PPO2 −11.0), paracrine ligands (dpp −4.0, Actβ −6.8, Ilp6 −2.8, </w:t>
+      </w:r>
+      <w:r>
+        <w:rPr>
+          <w:rFonts w:ascii="Arial" w:cs="Arial" w:eastAsia="Arial" w:hAnsi="Arial"/>
+        </w:rPr>
+        <w:t xml:space="preserve">upd1 −3.6</w:t>
+      </w:r>
+      <w:r>
+        <w:rPr>
+          <w:rFonts w:ascii="Arial" w:cs="Arial" w:eastAsia="Arial" w:hAnsi="Arial"/>
+          <w:b/>
+          <w:bCs/>
+        </w:rPr>
+        <w:t xml:space="preserve">), and ecdysone-response genes (Hr3 −4.3, ImpL1 −5.8, E93 −3.9) while retaining EcR. They also silenced the pro-apoptotic genes grim (−6.4) and sickle (−6.1) and the Bcl-2 family gene Buffy (−3.1). The consistently gained genes were mostly mitotic regulators (stg +2.0, CycB +1.3, Incenp, BubR1), while the endocycle switch fzr decreased (−2.1). All log2 fold changes in this section have adjusted p &lt; 0.05 (Table 1; full results in Table S2).</w:t>
       </w:r>
     </w:p>
     <w:p>
@@ -1007,7 +1093,7 @@
                 <w:sz w:val="18"/>
                 <w:szCs w:val="18"/>
               </w:rPr>
-              <w:t xml:space="preserve">Primary vs embryo</w:t>
+              <w:t xml:space="preserve">Primary cell line vs embryo</w:t>
             </w:r>
           </w:p>
         </w:tc>
@@ -1042,7 +1128,7 @@
                 <w:sz w:val="18"/>
                 <w:szCs w:val="18"/>
               </w:rPr>
-              <w:t xml:space="preserve">Line vs primary</w:t>
+              <w:t xml:space="preserve">Cell line vs primary cell line</w:t>
             </w:r>
           </w:p>
         </w:tc>
@@ -4388,8 +4474,746 @@
           <w:b/>
           <w:bCs/>
         </w:rPr>
-        <w:t xml:space="preserve">To test whether the silenced genes are Polycomb targets, we measured the fraction of each gene body covered by embryonic H3K27me3 domains and by Polycomb-repressed chromatin in S2 and BG3 cells (modENCODE 9-state model, state 6); all eight Hox genes were marked in all three maps. Genes switched off in every cell line were strongly enriched for Polycomb marking relative to unchanged genes (Figure 8): 19.8% versus 1.3% for embryonic H3K27me3 (odds ratio adjusted for gene length and primary-cell-line expression, 9.3), 7.8% versus 0.16% for the BG3 Polycomb state (40), and 7.5% versus 0.08% for the S2 Polycomb state (72; all p &lt; 0.001). Consistently down-regulated genes showed weaker enrichment (adjusted odds ratios 5.7–13), and marking rose steadily with the size of the decrease. Most silenced genes were not marked; these were mainly injury- and fat-body-response genes that primary cell lines induce. The 20 genes marked in all three maps included developmental regulators such as Antp, abd-A, Abd-B, svp, lz, fkh, disco, dac, sv, Drgx, and Dr, and marked down-regulated genes included SoxN, mirr, grh, kn, TfAP-2, Kr, hth, pros, esg, dpp, hh, and Wnt4. These loci were therefore Polycomb targets before culture and sit in Polycomb chromatin in two unrelated established cell lines.</w:t>
-      </w:r>
+        <w:t xml:space="preserve">To test whether the silenced genes are Polycomb targets, we measured the fraction of each gene body covered by embryonic H3K27me3 domains and by Polycomb-repressed chromatin in S2 and BG3 cells (modENCODE 9-state model, state 6); all eight Hox genes were marked in all three maps. Genes switched off in every cell line were strongly enriched for Polycomb marking relative to unchanged genes (Figure 8): 19.8% versus 1.3% for embryonic H3K27me3 (odds ratio adjusted for gene length and primary-cell-line expression, 9.3), 7.8% versus 0.16% for the BG3 Polycomb state (40), and 7.5% versus 0.08% for the S2 Polycomb state (72; all p &lt; 0.001). Consistently down-regulated genes showed weaker enrichment (adjusted odds ratios 5.7–13; Table 2), and among all genes that decreased, each log2 unit of decrease raised the odds of marking 1.29-fold for embryonic H3K27me3, 1.36-fold for BG3, and 1.43-fold for S2 (logistic regression adjusted for gene length and expression; p &lt; 10⁻¹⁶ for all). Most switched-off genes (263 of 333) were unmarked in all three maps [pending: GO enrichment of these genes, go_off_unmarked.csv]. The 20 genes marked in all three maps included developmental regulators such as Antp, abd-A, Abd-B, svp, lz, fkh, disco, dac, sv, Drgx, and Dr, and marked down-regulated genes included SoxN, mirr, grh, kn, TfAP-2, Kr, hth, pros, esg, dpp, hh, and Wnt4. These loci were therefore Polycomb targets before culture and sit in Polycomb chromatin in two unrelated established cell lines.</w:t>
+      </w:r>
+    </w:p>
+    <w:p>
+      <w:pPr>
+        <w:spacing w:after="80" w:before="120"/>
+      </w:pPr>
+      <w:r>
+        <w:rPr>
+          <w:rFonts w:ascii="Arial" w:cs="Arial" w:eastAsia="Arial" w:hAnsi="Arial"/>
+          <w:b/>
+          <w:bCs/>
+          <w:i/>
+          <w:iCs/>
+          <w:sz w:val="18"/>
+          <w:szCs w:val="18"/>
+        </w:rPr>
+        <w:t xml:space="preserve">Table 2. Polycomb marking by gene group. Percentage of genes with at least 50% of the gene body in each map; odds ratio versus unchanged genes adjusted for gene length and primary-cell-line expression (logistic regression). Gene groups include only genes expressed in every primary cell line.</w:t>
+      </w:r>
+    </w:p>
+    <w:tbl>
+      <w:tblPr>
+        <w:tblW w:type="dxa" w:w="9360"/>
+        <w:tblBorders>
+          <w:top w:val="single" w:color="auto" w:sz="4"/>
+          <w:left w:val="single" w:color="auto" w:sz="4"/>
+          <w:bottom w:val="single" w:color="auto" w:sz="4"/>
+          <w:right w:val="single" w:color="auto" w:sz="4"/>
+          <w:insideH w:val="single" w:color="auto" w:sz="4"/>
+          <w:insideV w:val="single" w:color="auto" w:sz="4"/>
+        </w:tblBorders>
+      </w:tblPr>
+      <w:tblGrid>
+        <w:gridCol w:w="2760"/>
+        <w:gridCol w:w="2200"/>
+        <w:gridCol w:w="2200"/>
+        <w:gridCol w:w="2200"/>
+      </w:tblGrid>
+      <w:tr>
+        <w:trPr>
+          <w:tblHeader/>
+        </w:trPr>
+        <w:tc>
+          <w:tcPr>
+            <w:tcW w:type="dxa" w:w="2760"/>
+            <w:tcBorders>
+              <w:top w:val="single" w:color="BBBBBB" w:sz="4"/>
+              <w:left w:val="single" w:color="BBBBBB" w:sz="4"/>
+              <w:bottom w:val="single" w:color="BBBBBB" w:sz="4"/>
+              <w:right w:val="single" w:color="BBBBBB" w:sz="4"/>
+            </w:tcBorders>
+            <w:shd w:fill="E8EEF4" w:color="auto" w:val="clear"/>
+            <w:tcMar>
+              <w:top w:type="dxa" w:w="40"/>
+              <w:left w:type="dxa" w:w="80"/>
+              <w:bottom w:type="dxa" w:w="40"/>
+              <w:right w:type="dxa" w:w="80"/>
+            </w:tcMar>
+          </w:tcPr>
+          <w:p>
+            <w:pPr>
+              <w:jc w:val="left"/>
+            </w:pPr>
+            <w:r>
+              <w:rPr>
+                <w:rFonts w:ascii="Arial" w:cs="Arial" w:eastAsia="Arial" w:hAnsi="Arial"/>
+                <w:b/>
+                <w:bCs/>
+                <w:i w:val="false"/>
+                <w:iCs w:val="false"/>
+                <w:sz w:val="18"/>
+                <w:szCs w:val="18"/>
+              </w:rPr>
+              <w:t xml:space="preserve">Gene group (n)</w:t>
+            </w:r>
+          </w:p>
+        </w:tc>
+        <w:tc>
+          <w:tcPr>
+            <w:tcW w:type="dxa" w:w="2200"/>
+            <w:tcBorders>
+              <w:top w:val="single" w:color="BBBBBB" w:sz="4"/>
+              <w:left w:val="single" w:color="BBBBBB" w:sz="4"/>
+              <w:bottom w:val="single" w:color="BBBBBB" w:sz="4"/>
+              <w:right w:val="single" w:color="BBBBBB" w:sz="4"/>
+            </w:tcBorders>
+            <w:shd w:fill="E8EEF4" w:color="auto" w:val="clear"/>
+            <w:tcMar>
+              <w:top w:type="dxa" w:w="40"/>
+              <w:left w:type="dxa" w:w="80"/>
+              <w:bottom w:type="dxa" w:w="40"/>
+              <w:right w:type="dxa" w:w="80"/>
+            </w:tcMar>
+          </w:tcPr>
+          <w:p>
+            <w:pPr>
+              <w:jc w:val="center"/>
+            </w:pPr>
+            <w:r>
+              <w:rPr>
+                <w:rFonts w:ascii="Arial" w:cs="Arial" w:eastAsia="Arial" w:hAnsi="Arial"/>
+                <w:b/>
+                <w:bCs/>
+                <w:i w:val="false"/>
+                <w:iCs w:val="false"/>
+                <w:sz w:val="18"/>
+                <w:szCs w:val="18"/>
+              </w:rPr>
+              <w:t xml:space="preserve">Embryo H3K27me3</w:t>
+            </w:r>
+          </w:p>
+        </w:tc>
+        <w:tc>
+          <w:tcPr>
+            <w:tcW w:type="dxa" w:w="2200"/>
+            <w:tcBorders>
+              <w:top w:val="single" w:color="BBBBBB" w:sz="4"/>
+              <w:left w:val="single" w:color="BBBBBB" w:sz="4"/>
+              <w:bottom w:val="single" w:color="BBBBBB" w:sz="4"/>
+              <w:right w:val="single" w:color="BBBBBB" w:sz="4"/>
+            </w:tcBorders>
+            <w:shd w:fill="E8EEF4" w:color="auto" w:val="clear"/>
+            <w:tcMar>
+              <w:top w:type="dxa" w:w="40"/>
+              <w:left w:type="dxa" w:w="80"/>
+              <w:bottom w:type="dxa" w:w="40"/>
+              <w:right w:type="dxa" w:w="80"/>
+            </w:tcMar>
+          </w:tcPr>
+          <w:p>
+            <w:pPr>
+              <w:jc w:val="center"/>
+            </w:pPr>
+            <w:r>
+              <w:rPr>
+                <w:rFonts w:ascii="Arial" w:cs="Arial" w:eastAsia="Arial" w:hAnsi="Arial"/>
+                <w:b/>
+                <w:bCs/>
+                <w:i w:val="false"/>
+                <w:iCs w:val="false"/>
+                <w:sz w:val="18"/>
+                <w:szCs w:val="18"/>
+              </w:rPr>
+              <w:t xml:space="preserve">BG3 Pc state</w:t>
+            </w:r>
+          </w:p>
+        </w:tc>
+        <w:tc>
+          <w:tcPr>
+            <w:tcW w:type="dxa" w:w="2200"/>
+            <w:tcBorders>
+              <w:top w:val="single" w:color="BBBBBB" w:sz="4"/>
+              <w:left w:val="single" w:color="BBBBBB" w:sz="4"/>
+              <w:bottom w:val="single" w:color="BBBBBB" w:sz="4"/>
+              <w:right w:val="single" w:color="BBBBBB" w:sz="4"/>
+            </w:tcBorders>
+            <w:shd w:fill="E8EEF4" w:color="auto" w:val="clear"/>
+            <w:tcMar>
+              <w:top w:type="dxa" w:w="40"/>
+              <w:left w:type="dxa" w:w="80"/>
+              <w:bottom w:type="dxa" w:w="40"/>
+              <w:right w:type="dxa" w:w="80"/>
+            </w:tcMar>
+          </w:tcPr>
+          <w:p>
+            <w:pPr>
+              <w:jc w:val="center"/>
+            </w:pPr>
+            <w:r>
+              <w:rPr>
+                <w:rFonts w:ascii="Arial" w:cs="Arial" w:eastAsia="Arial" w:hAnsi="Arial"/>
+                <w:b/>
+                <w:bCs/>
+                <w:i w:val="false"/>
+                <w:iCs w:val="false"/>
+                <w:sz w:val="18"/>
+                <w:szCs w:val="18"/>
+              </w:rPr>
+              <w:t xml:space="preserve">S2 Pc state</w:t>
+            </w:r>
+          </w:p>
+        </w:tc>
+      </w:tr>
+      <w:tr>
+        <w:tc>
+          <w:tcPr>
+            <w:tcW w:type="dxa" w:w="2760"/>
+            <w:tcBorders>
+              <w:top w:val="single" w:color="BBBBBB" w:sz="4"/>
+              <w:left w:val="single" w:color="BBBBBB" w:sz="4"/>
+              <w:bottom w:val="single" w:color="BBBBBB" w:sz="4"/>
+              <w:right w:val="single" w:color="BBBBBB" w:sz="4"/>
+            </w:tcBorders>
+            <w:tcMar>
+              <w:top w:type="dxa" w:w="40"/>
+              <w:left w:type="dxa" w:w="80"/>
+              <w:bottom w:type="dxa" w:w="40"/>
+              <w:right w:type="dxa" w:w="80"/>
+            </w:tcMar>
+          </w:tcPr>
+          <w:p>
+            <w:pPr>
+              <w:jc w:val="left"/>
+            </w:pPr>
+            <w:r>
+              <w:rPr>
+                <w:rFonts w:ascii="Arial" w:cs="Arial" w:eastAsia="Arial" w:hAnsi="Arial"/>
+                <w:b/>
+                <w:bCs/>
+                <w:i w:val="false"/>
+                <w:iCs w:val="false"/>
+                <w:sz w:val="18"/>
+                <w:szCs w:val="18"/>
+              </w:rPr>
+              <w:t xml:space="preserve">Off in all cell lines (333)</w:t>
+            </w:r>
+          </w:p>
+        </w:tc>
+        <w:tc>
+          <w:tcPr>
+            <w:tcW w:type="dxa" w:w="2200"/>
+            <w:tcBorders>
+              <w:top w:val="single" w:color="BBBBBB" w:sz="4"/>
+              <w:left w:val="single" w:color="BBBBBB" w:sz="4"/>
+              <w:bottom w:val="single" w:color="BBBBBB" w:sz="4"/>
+              <w:right w:val="single" w:color="BBBBBB" w:sz="4"/>
+            </w:tcBorders>
+            <w:tcMar>
+              <w:top w:type="dxa" w:w="40"/>
+              <w:left w:type="dxa" w:w="80"/>
+              <w:bottom w:type="dxa" w:w="40"/>
+              <w:right w:type="dxa" w:w="80"/>
+            </w:tcMar>
+          </w:tcPr>
+          <w:p>
+            <w:pPr>
+              <w:jc w:val="center"/>
+            </w:pPr>
+            <w:r>
+              <w:rPr>
+                <w:rFonts w:ascii="Arial" w:cs="Arial" w:eastAsia="Arial" w:hAnsi="Arial"/>
+                <w:b/>
+                <w:bCs/>
+                <w:i w:val="false"/>
+                <w:iCs w:val="false"/>
+                <w:sz w:val="18"/>
+                <w:szCs w:val="18"/>
+              </w:rPr>
+              <w:t xml:space="preserve">19.8% (OR 9.3; p &lt; 0.001)</w:t>
+            </w:r>
+          </w:p>
+        </w:tc>
+        <w:tc>
+          <w:tcPr>
+            <w:tcW w:type="dxa" w:w="2200"/>
+            <w:tcBorders>
+              <w:top w:val="single" w:color="BBBBBB" w:sz="4"/>
+              <w:left w:val="single" w:color="BBBBBB" w:sz="4"/>
+              <w:bottom w:val="single" w:color="BBBBBB" w:sz="4"/>
+              <w:right w:val="single" w:color="BBBBBB" w:sz="4"/>
+            </w:tcBorders>
+            <w:tcMar>
+              <w:top w:type="dxa" w:w="40"/>
+              <w:left w:type="dxa" w:w="80"/>
+              <w:bottom w:type="dxa" w:w="40"/>
+              <w:right w:type="dxa" w:w="80"/>
+            </w:tcMar>
+          </w:tcPr>
+          <w:p>
+            <w:pPr>
+              <w:jc w:val="center"/>
+            </w:pPr>
+            <w:r>
+              <w:rPr>
+                <w:rFonts w:ascii="Arial" w:cs="Arial" w:eastAsia="Arial" w:hAnsi="Arial"/>
+                <w:b/>
+                <w:bCs/>
+                <w:i w:val="false"/>
+                <w:iCs w:val="false"/>
+                <w:sz w:val="18"/>
+                <w:szCs w:val="18"/>
+              </w:rPr>
+              <w:t xml:space="preserve">7.8% (OR 40; p &lt; 0.001)</w:t>
+            </w:r>
+          </w:p>
+        </w:tc>
+        <w:tc>
+          <w:tcPr>
+            <w:tcW w:type="dxa" w:w="2200"/>
+            <w:tcBorders>
+              <w:top w:val="single" w:color="BBBBBB" w:sz="4"/>
+              <w:left w:val="single" w:color="BBBBBB" w:sz="4"/>
+              <w:bottom w:val="single" w:color="BBBBBB" w:sz="4"/>
+              <w:right w:val="single" w:color="BBBBBB" w:sz="4"/>
+            </w:tcBorders>
+            <w:tcMar>
+              <w:top w:type="dxa" w:w="40"/>
+              <w:left w:type="dxa" w:w="80"/>
+              <w:bottom w:type="dxa" w:w="40"/>
+              <w:right w:type="dxa" w:w="80"/>
+            </w:tcMar>
+          </w:tcPr>
+          <w:p>
+            <w:pPr>
+              <w:jc w:val="center"/>
+            </w:pPr>
+            <w:r>
+              <w:rPr>
+                <w:rFonts w:ascii="Arial" w:cs="Arial" w:eastAsia="Arial" w:hAnsi="Arial"/>
+                <w:b/>
+                <w:bCs/>
+                <w:i w:val="false"/>
+                <w:iCs w:val="false"/>
+                <w:sz w:val="18"/>
+                <w:szCs w:val="18"/>
+              </w:rPr>
+              <w:t xml:space="preserve">7.5% (OR 72; p &lt; 0.001)</w:t>
+            </w:r>
+          </w:p>
+        </w:tc>
+      </w:tr>
+      <w:tr>
+        <w:tc>
+          <w:tcPr>
+            <w:tcW w:type="dxa" w:w="2760"/>
+            <w:tcBorders>
+              <w:top w:val="single" w:color="BBBBBB" w:sz="4"/>
+              <w:left w:val="single" w:color="BBBBBB" w:sz="4"/>
+              <w:bottom w:val="single" w:color="BBBBBB" w:sz="4"/>
+              <w:right w:val="single" w:color="BBBBBB" w:sz="4"/>
+            </w:tcBorders>
+            <w:tcMar>
+              <w:top w:type="dxa" w:w="40"/>
+              <w:left w:type="dxa" w:w="80"/>
+              <w:bottom w:type="dxa" w:w="40"/>
+              <w:right w:type="dxa" w:w="80"/>
+            </w:tcMar>
+          </w:tcPr>
+          <w:p>
+            <w:pPr>
+              <w:jc w:val="left"/>
+            </w:pPr>
+            <w:r>
+              <w:rPr>
+                <w:rFonts w:ascii="Arial" w:cs="Arial" w:eastAsia="Arial" w:hAnsi="Arial"/>
+                <w:b/>
+                <w:bCs/>
+                <w:i w:val="false"/>
+                <w:iCs w:val="false"/>
+                <w:sz w:val="18"/>
+                <w:szCs w:val="18"/>
+              </w:rPr>
+              <w:t xml:space="preserve">Consistently down (697)</w:t>
+            </w:r>
+          </w:p>
+        </w:tc>
+        <w:tc>
+          <w:tcPr>
+            <w:tcW w:type="dxa" w:w="2200"/>
+            <w:tcBorders>
+              <w:top w:val="single" w:color="BBBBBB" w:sz="4"/>
+              <w:left w:val="single" w:color="BBBBBB" w:sz="4"/>
+              <w:bottom w:val="single" w:color="BBBBBB" w:sz="4"/>
+              <w:right w:val="single" w:color="BBBBBB" w:sz="4"/>
+            </w:tcBorders>
+            <w:tcMar>
+              <w:top w:type="dxa" w:w="40"/>
+              <w:left w:type="dxa" w:w="80"/>
+              <w:bottom w:type="dxa" w:w="40"/>
+              <w:right w:type="dxa" w:w="80"/>
+            </w:tcMar>
+          </w:tcPr>
+          <w:p>
+            <w:pPr>
+              <w:jc w:val="center"/>
+            </w:pPr>
+            <w:r>
+              <w:rPr>
+                <w:rFonts w:ascii="Arial" w:cs="Arial" w:eastAsia="Arial" w:hAnsi="Arial"/>
+                <w:b/>
+                <w:bCs/>
+                <w:i w:val="false"/>
+                <w:iCs w:val="false"/>
+                <w:sz w:val="18"/>
+                <w:szCs w:val="18"/>
+              </w:rPr>
+              <w:t xml:space="preserve">10.9% (OR 5.7; p &lt; 0.001)</w:t>
+            </w:r>
+          </w:p>
+        </w:tc>
+        <w:tc>
+          <w:tcPr>
+            <w:tcW w:type="dxa" w:w="2200"/>
+            <w:tcBorders>
+              <w:top w:val="single" w:color="BBBBBB" w:sz="4"/>
+              <w:left w:val="single" w:color="BBBBBB" w:sz="4"/>
+              <w:bottom w:val="single" w:color="BBBBBB" w:sz="4"/>
+              <w:right w:val="single" w:color="BBBBBB" w:sz="4"/>
+            </w:tcBorders>
+            <w:tcMar>
+              <w:top w:type="dxa" w:w="40"/>
+              <w:left w:type="dxa" w:w="80"/>
+              <w:bottom w:type="dxa" w:w="40"/>
+              <w:right w:type="dxa" w:w="80"/>
+            </w:tcMar>
+          </w:tcPr>
+          <w:p>
+            <w:pPr>
+              <w:jc w:val="center"/>
+            </w:pPr>
+            <w:r>
+              <w:rPr>
+                <w:rFonts w:ascii="Arial" w:cs="Arial" w:eastAsia="Arial" w:hAnsi="Arial"/>
+                <w:b/>
+                <w:bCs/>
+                <w:i w:val="false"/>
+                <w:iCs w:val="false"/>
+                <w:sz w:val="18"/>
+                <w:szCs w:val="18"/>
+              </w:rPr>
+              <w:t xml:space="preserve">3.3% (OR 10; p &lt; 0.001)</w:t>
+            </w:r>
+          </w:p>
+        </w:tc>
+        <w:tc>
+          <w:tcPr>
+            <w:tcW w:type="dxa" w:w="2200"/>
+            <w:tcBorders>
+              <w:top w:val="single" w:color="BBBBBB" w:sz="4"/>
+              <w:left w:val="single" w:color="BBBBBB" w:sz="4"/>
+              <w:bottom w:val="single" w:color="BBBBBB" w:sz="4"/>
+              <w:right w:val="single" w:color="BBBBBB" w:sz="4"/>
+            </w:tcBorders>
+            <w:tcMar>
+              <w:top w:type="dxa" w:w="40"/>
+              <w:left w:type="dxa" w:w="80"/>
+              <w:bottom w:type="dxa" w:w="40"/>
+              <w:right w:type="dxa" w:w="80"/>
+            </w:tcMar>
+          </w:tcPr>
+          <w:p>
+            <w:pPr>
+              <w:jc w:val="center"/>
+            </w:pPr>
+            <w:r>
+              <w:rPr>
+                <w:rFonts w:ascii="Arial" w:cs="Arial" w:eastAsia="Arial" w:hAnsi="Arial"/>
+                <w:b/>
+                <w:bCs/>
+                <w:i w:val="false"/>
+                <w:iCs w:val="false"/>
+                <w:sz w:val="18"/>
+                <w:szCs w:val="18"/>
+              </w:rPr>
+              <w:t xml:space="preserve">2.6% (OR 13; p &lt; 0.001)</w:t>
+            </w:r>
+          </w:p>
+        </w:tc>
+      </w:tr>
+      <w:tr>
+        <w:tc>
+          <w:tcPr>
+            <w:tcW w:type="dxa" w:w="2760"/>
+            <w:tcBorders>
+              <w:top w:val="single" w:color="BBBBBB" w:sz="4"/>
+              <w:left w:val="single" w:color="BBBBBB" w:sz="4"/>
+              <w:bottom w:val="single" w:color="BBBBBB" w:sz="4"/>
+              <w:right w:val="single" w:color="BBBBBB" w:sz="4"/>
+            </w:tcBorders>
+            <w:tcMar>
+              <w:top w:type="dxa" w:w="40"/>
+              <w:left w:type="dxa" w:w="80"/>
+              <w:bottom w:type="dxa" w:w="40"/>
+              <w:right w:type="dxa" w:w="80"/>
+            </w:tcMar>
+          </w:tcPr>
+          <w:p>
+            <w:pPr>
+              <w:jc w:val="left"/>
+            </w:pPr>
+            <w:r>
+              <w:rPr>
+                <w:rFonts w:ascii="Arial" w:cs="Arial" w:eastAsia="Arial" w:hAnsi="Arial"/>
+                <w:b/>
+                <w:bCs/>
+                <w:i w:val="false"/>
+                <w:iCs w:val="false"/>
+                <w:sz w:val="18"/>
+                <w:szCs w:val="18"/>
+              </w:rPr>
+              <w:t xml:space="preserve">Consistently up (46)</w:t>
+            </w:r>
+          </w:p>
+        </w:tc>
+        <w:tc>
+          <w:tcPr>
+            <w:tcW w:type="dxa" w:w="2200"/>
+            <w:tcBorders>
+              <w:top w:val="single" w:color="BBBBBB" w:sz="4"/>
+              <w:left w:val="single" w:color="BBBBBB" w:sz="4"/>
+              <w:bottom w:val="single" w:color="BBBBBB" w:sz="4"/>
+              <w:right w:val="single" w:color="BBBBBB" w:sz="4"/>
+            </w:tcBorders>
+            <w:tcMar>
+              <w:top w:type="dxa" w:w="40"/>
+              <w:left w:type="dxa" w:w="80"/>
+              <w:bottom w:type="dxa" w:w="40"/>
+              <w:right w:type="dxa" w:w="80"/>
+            </w:tcMar>
+          </w:tcPr>
+          <w:p>
+            <w:pPr>
+              <w:jc w:val="center"/>
+            </w:pPr>
+            <w:r>
+              <w:rPr>
+                <w:rFonts w:ascii="Arial" w:cs="Arial" w:eastAsia="Arial" w:hAnsi="Arial"/>
+                <w:b/>
+                <w:bCs/>
+                <w:i w:val="false"/>
+                <w:iCs w:val="false"/>
+                <w:sz w:val="18"/>
+                <w:szCs w:val="18"/>
+              </w:rPr>
+              <w:t xml:space="preserve">4.3% (OR 2.7; p = 0.20)</w:t>
+            </w:r>
+          </w:p>
+        </w:tc>
+        <w:tc>
+          <w:tcPr>
+            <w:tcW w:type="dxa" w:w="2200"/>
+            <w:tcBorders>
+              <w:top w:val="single" w:color="BBBBBB" w:sz="4"/>
+              <w:left w:val="single" w:color="BBBBBB" w:sz="4"/>
+              <w:bottom w:val="single" w:color="BBBBBB" w:sz="4"/>
+              <w:right w:val="single" w:color="BBBBBB" w:sz="4"/>
+            </w:tcBorders>
+            <w:tcMar>
+              <w:top w:type="dxa" w:w="40"/>
+              <w:left w:type="dxa" w:w="80"/>
+              <w:bottom w:type="dxa" w:w="40"/>
+              <w:right w:type="dxa" w:w="80"/>
+            </w:tcMar>
+          </w:tcPr>
+          <w:p>
+            <w:pPr>
+              <w:jc w:val="center"/>
+            </w:pPr>
+            <w:r>
+              <w:rPr>
+                <w:rFonts w:ascii="Arial" w:cs="Arial" w:eastAsia="Arial" w:hAnsi="Arial"/>
+                <w:b/>
+                <w:bCs/>
+                <w:i w:val="false"/>
+                <w:iCs w:val="false"/>
+                <w:sz w:val="18"/>
+                <w:szCs w:val="18"/>
+              </w:rPr>
+              <w:t xml:space="preserve">2.2% (OR 10; p = 0.04)</w:t>
+            </w:r>
+          </w:p>
+        </w:tc>
+        <w:tc>
+          <w:tcPr>
+            <w:tcW w:type="dxa" w:w="2200"/>
+            <w:tcBorders>
+              <w:top w:val="single" w:color="BBBBBB" w:sz="4"/>
+              <w:left w:val="single" w:color="BBBBBB" w:sz="4"/>
+              <w:bottom w:val="single" w:color="BBBBBB" w:sz="4"/>
+              <w:right w:val="single" w:color="BBBBBB" w:sz="4"/>
+            </w:tcBorders>
+            <w:tcMar>
+              <w:top w:type="dxa" w:w="40"/>
+              <w:left w:type="dxa" w:w="80"/>
+              <w:bottom w:type="dxa" w:w="40"/>
+              <w:right w:type="dxa" w:w="80"/>
+            </w:tcMar>
+          </w:tcPr>
+          <w:p>
+            <w:pPr>
+              <w:jc w:val="center"/>
+            </w:pPr>
+            <w:r>
+              <w:rPr>
+                <w:rFonts w:ascii="Arial" w:cs="Arial" w:eastAsia="Arial" w:hAnsi="Arial"/>
+                <w:b/>
+                <w:bCs/>
+                <w:i w:val="false"/>
+                <w:iCs w:val="false"/>
+                <w:sz w:val="18"/>
+                <w:szCs w:val="18"/>
+              </w:rPr>
+              <w:t xml:space="preserve">0% (n.s.)</w:t>
+            </w:r>
+          </w:p>
+        </w:tc>
+      </w:tr>
+      <w:tr>
+        <w:tc>
+          <w:tcPr>
+            <w:tcW w:type="dxa" w:w="2760"/>
+            <w:tcBorders>
+              <w:top w:val="single" w:color="BBBBBB" w:sz="4"/>
+              <w:left w:val="single" w:color="BBBBBB" w:sz="4"/>
+              <w:bottom w:val="single" w:color="BBBBBB" w:sz="4"/>
+              <w:right w:val="single" w:color="BBBBBB" w:sz="4"/>
+            </w:tcBorders>
+            <w:tcMar>
+              <w:top w:type="dxa" w:w="40"/>
+              <w:left w:type="dxa" w:w="80"/>
+              <w:bottom w:type="dxa" w:w="40"/>
+              <w:right w:type="dxa" w:w="80"/>
+            </w:tcMar>
+          </w:tcPr>
+          <w:p>
+            <w:pPr>
+              <w:jc w:val="left"/>
+            </w:pPr>
+            <w:r>
+              <w:rPr>
+                <w:rFonts w:ascii="Arial" w:cs="Arial" w:eastAsia="Arial" w:hAnsi="Arial"/>
+                <w:b/>
+                <w:bCs/>
+                <w:i w:val="false"/>
+                <w:iCs w:val="false"/>
+                <w:sz w:val="18"/>
+                <w:szCs w:val="18"/>
+              </w:rPr>
+              <w:t xml:space="preserve">Unchanged (3,862)</w:t>
+            </w:r>
+          </w:p>
+        </w:tc>
+        <w:tc>
+          <w:tcPr>
+            <w:tcW w:type="dxa" w:w="2200"/>
+            <w:tcBorders>
+              <w:top w:val="single" w:color="BBBBBB" w:sz="4"/>
+              <w:left w:val="single" w:color="BBBBBB" w:sz="4"/>
+              <w:bottom w:val="single" w:color="BBBBBB" w:sz="4"/>
+              <w:right w:val="single" w:color="BBBBBB" w:sz="4"/>
+            </w:tcBorders>
+            <w:tcMar>
+              <w:top w:type="dxa" w:w="40"/>
+              <w:left w:type="dxa" w:w="80"/>
+              <w:bottom w:type="dxa" w:w="40"/>
+              <w:right w:type="dxa" w:w="80"/>
+            </w:tcMar>
+          </w:tcPr>
+          <w:p>
+            <w:pPr>
+              <w:jc w:val="center"/>
+            </w:pPr>
+            <w:r>
+              <w:rPr>
+                <w:rFonts w:ascii="Arial" w:cs="Arial" w:eastAsia="Arial" w:hAnsi="Arial"/>
+                <w:b/>
+                <w:bCs/>
+                <w:i w:val="false"/>
+                <w:iCs w:val="false"/>
+                <w:sz w:val="18"/>
+                <w:szCs w:val="18"/>
+              </w:rPr>
+              <w:t xml:space="preserve">1.3% (reference)</w:t>
+            </w:r>
+          </w:p>
+        </w:tc>
+        <w:tc>
+          <w:tcPr>
+            <w:tcW w:type="dxa" w:w="2200"/>
+            <w:tcBorders>
+              <w:top w:val="single" w:color="BBBBBB" w:sz="4"/>
+              <w:left w:val="single" w:color="BBBBBB" w:sz="4"/>
+              <w:bottom w:val="single" w:color="BBBBBB" w:sz="4"/>
+              <w:right w:val="single" w:color="BBBBBB" w:sz="4"/>
+            </w:tcBorders>
+            <w:tcMar>
+              <w:top w:type="dxa" w:w="40"/>
+              <w:left w:type="dxa" w:w="80"/>
+              <w:bottom w:type="dxa" w:w="40"/>
+              <w:right w:type="dxa" w:w="80"/>
+            </w:tcMar>
+          </w:tcPr>
+          <w:p>
+            <w:pPr>
+              <w:jc w:val="center"/>
+            </w:pPr>
+            <w:r>
+              <w:rPr>
+                <w:rFonts w:ascii="Arial" w:cs="Arial" w:eastAsia="Arial" w:hAnsi="Arial"/>
+                <w:b/>
+                <w:bCs/>
+                <w:i w:val="false"/>
+                <w:iCs w:val="false"/>
+                <w:sz w:val="18"/>
+                <w:szCs w:val="18"/>
+              </w:rPr>
+              <w:t xml:space="preserve">0.16% (reference)</w:t>
+            </w:r>
+          </w:p>
+        </w:tc>
+        <w:tc>
+          <w:tcPr>
+            <w:tcW w:type="dxa" w:w="2200"/>
+            <w:tcBorders>
+              <w:top w:val="single" w:color="BBBBBB" w:sz="4"/>
+              <w:left w:val="single" w:color="BBBBBB" w:sz="4"/>
+              <w:bottom w:val="single" w:color="BBBBBB" w:sz="4"/>
+              <w:right w:val="single" w:color="BBBBBB" w:sz="4"/>
+            </w:tcBorders>
+            <w:tcMar>
+              <w:top w:type="dxa" w:w="40"/>
+              <w:left w:type="dxa" w:w="80"/>
+              <w:bottom w:type="dxa" w:w="40"/>
+              <w:right w:type="dxa" w:w="80"/>
+            </w:tcMar>
+          </w:tcPr>
+          <w:p>
+            <w:pPr>
+              <w:jc w:val="center"/>
+            </w:pPr>
+            <w:r>
+              <w:rPr>
+                <w:rFonts w:ascii="Arial" w:cs="Arial" w:eastAsia="Arial" w:hAnsi="Arial"/>
+                <w:b/>
+                <w:bCs/>
+                <w:i w:val="false"/>
+                <w:iCs w:val="false"/>
+                <w:sz w:val="18"/>
+                <w:szCs w:val="18"/>
+              </w:rPr>
+              <w:t xml:space="preserve">0.08% (reference)</w:t>
+            </w:r>
+          </w:p>
+        </w:tc>
+      </w:tr>
+    </w:tbl>
+    <w:p>
+      <w:pPr>
+        <w:spacing w:after="200"/>
+      </w:pPr>
     </w:p>
     <w:p>
       <w:pPr>
@@ -4477,7 +5301,7 @@
           <w:b/>
           <w:bCs/>
         </w:rPr>
-        <w:t xml:space="preserve">The cell lines lost nearly every receptor tyrosine kinase expressed in primary cell lines, including Egfr (−6.3), htl (−6.8), Drl-2 (−6.7), otk (−6.0), sev (−4.1), and btl (−2.6). Pvr, the PDGF/VEGF receptor homolog, was the only receptor tyrosine kinase that increased (+1.3 in all four lineages), and its ligand Pvf2 rose in primary cell lines (+2.2) and stayed expressed in cell lines. Classic MAPK feedback targets increased despite the loss of EGFR (sty +1.7, pnt +1.5, kek1 +1.4, CG6006 +1.4, all four lineages; Mkp3 +1.0, pooled), as did the PI3K growth effector Orct2 (+1.9, all four lineages). Within single cells, Pvr expression correlated weakly with a MAPK target score after controlling for sequencing depth (ρ positive in 16 of 18 samples, up to 0.24, and 0.06–0.24 in cell lines except the 126-cell ubkhc-1 library; Figure 9), and Pvr-positive cells in primary cell lines had slightly higher MAPK scores than Pvr-negative cells in three of four lineages (p &lt; 0.001). Pvr did not correlate with proliferation, and the most proliferative cells in primary cell lines were not consistently Pvr-high, so PVR signaling marks established cell lines rather than the proliferative cells in primary cell lines that resemble them.</w:t>
+        <w:t xml:space="preserve">The cell lines lost nearly every receptor tyrosine kinase expressed in primary cell lines, including Egfr (−6.3), htl (−6.8), Drl-2 (−6.7), otk (−6.0), sev (−4.1), and btl (−2.6). Pvr, the PDGF/VEGF receptor homolog, was the only receptor tyrosine kinase that increased (+1.3 in all four lineages), and its ligand Pvf2 rose in primary cell lines (+2.2) and stayed expressed in cell lines. Classic MAPK feedback targets increased despite the loss of EGFR (sty +1.7, pnt +1.5, kek1 +1.4, CG6006 +1.4, all four lineages; Mkp3 +1.0, pooled), as did the PI3K growth effector Orct2 (+1.9, all four lineages). Within single cells, Pvr expression correlated weakly with a MAPK target score after controlling for sequencing depth (ρ positive in 16 of 18 samples, sign test p = 0.001; up to 0.24, and 0.06–0.24 in cell lines except the 126-cell ubkhc-1 library; Figure 9; Table S6). Pvr-positive cells in primary cell lines had higher MAPK scores than Pvr-negative cells in three lineages (difference +0.04 to +0.06; Mann–Whitney p &lt; 0.001) and lower scores in Dmel_Ubkhc (−0.06; p &lt; 0.001). Pvr did not correlate with proliferation (ρ −0.07 to 0.16 across samples), and the most proliferative cells in primary cell lines were not consistently Pvr-high (Pvr difference +0.05, p = 0.02; −0.11, p &lt; 0.001; +0.08, p &lt; 0.001; −0.06, p = 0.02, for Dmel_JupiterGFP, Dmel_Ubkhc, Dsim_Merrill23, and Dsim_w), so PVR signaling marks established cell lines rather than the proliferative cells in primary cell lines that resemble them.</w:t>
       </w:r>
     </w:p>
     <w:p>
@@ -4597,7 +5421,7 @@
           <w:b/>
           <w:bCs/>
         </w:rPr>
-        <w:t xml:space="preserve">Dsim6B-wMel and Dsim6B offered a direct comparison of an infected cell line with a doxycycline-cured cell line of the same origin, since both derive from wRi-infected D. simulans w− flies (two libraries each). The two cell lines differed at 4,783 genes (adjusted p &lt; 0.05). The infected cell line up-regulated the pro-apoptotic genes reaper (+4.4) and hid (+3.2), the JAK/STAT stress genes upd3 (+1.4) and Socs36E (+1.4), and apoptosis, autophagic cell death, Hippo regulation, and glutathione metabolism terms, and it down-regulated ribosome biogenesis, mitosis, and fatty acid β-oxidation (Figure S1). Infection-associated changes barely tracked the cell-line-versus-primary-cell-line program (ρ = 0.06–0.08). However, Dsim6B-wMel expressed white (log2 CPM 6.2 versus 0–0.3 in Dsim6B and about 1.4 in the D. simulans w− embryo and primary cell line) and had lost plasmatocyte and basement-membrane genes that Dsim6B expresses (Hml, Pxn, Col4a1, vkg), so the two cell lines differ in cell identity, and possibly genotype, as well as infection. Doxycycline also inhibits mitochondrial translation, so the cured line may carry treatment effects in addition to the loss of Wolbachia.</w:t>
+        <w:t xml:space="preserve">Dsim6B-wMel and Dsim6B offered a direct comparison of an infected cell line with a doxycycline-cured cell line of the same origin, since both derive from wRi-infected D. simulans w− flies (two libraries each, so the replicate variance estimate is limited). The two cell lines differed at 4,783 genes (adjusted p &lt; 0.05; Table S8). The infected cell line up-regulated the pro-apoptotic genes reaper (+4.4) and hid (+3.2) and the JAK/STAT stress genes upd3 (+1.4) and Socs36E (+1.4; adjusted p &lt; 10⁻²⁰ for all four), and apoptosis, autophagic cell death, Hippo regulation, and glutathione metabolism terms (NES 1.8–2.2; FDR 0.003–0.023), and it down-regulated ribosome biogenesis, mitotic nuclear division, and fatty acid β-oxidation (NES −2.2 to −2.4; FDR ≤ 0.002; Figure S1). Infection-associated changes barely tracked the cell-line-versus-primary-cell-line program (ρ = 0.06 across 8,305 genes, p = 3 × 10⁻⁸; ρ = 0.08 across 1,066 cell-line-program genes, p = 0.006). However, Dsim6B-wMel expressed white (log2 CPM 6.2 versus 0–0.3 in Dsim6B and about 1.4 in the D. simulans w− embryo and primary cell line) and had lost plasmatocyte and basement-membrane genes that Dsim6B expresses (Hml, Pxn, Col4a1, vkg), so the two cell lines differ in cell identity, and possibly genotype, as well as infection. Doxycycline also inhibits mitochondrial translation, so the cured line may carry treatment effects in addition to the loss of Wolbachia.</w:t>
       </w:r>
     </w:p>
     <w:p>
@@ -4728,7 +5552,7 @@
           <w:b/>
           <w:bCs/>
         </w:rPr>
-        <w:t xml:space="preserve">Three observations support selection specifically. Cell lines resembled one another more than their own parental embryo and matched no single embryonic reference tissue. The primary-to-cell-line transition was shared across four lineages in two species, with 84% of changed genes moving in the same direction in every lineage. Most directly, the most proliferative cells in three of four primary cell lines already carried part of the cell-line expression shift, beyond cell-cycle and ribosome genes and independent of sequencing depth. Because each stage is a separate snapshot, these data cannot show that those cells gave rise to the cell lines; a passage time course or lineage tracing would test this.</w:t>
+        <w:t xml:space="preserve">Three observations support selection specifically. Cell lines resembled one another more than their own parental embryos (p = 0.008) and correlated less with every embryonic reference tissue (p = 0.016). The primary-to-cell-line transition was shared across four lineages in two species, with 84% of changed genes moving in the same direction in every lineage. Most directly, the most proliferative cells in three of four primary cell lines already carried part of the cell-line expression shift, beyond cell-cycle and ribosome genes and independent of sequencing depth. Because each stage is a separate snapshot, these data cannot show that those cells gave rise to the cell lines; a passage time course or lineage tracing would test this.</w:t>
       </w:r>
     </w:p>
     <w:p>
@@ -4808,7 +5632,21 @@
         <w:rPr>
           <w:rFonts w:ascii="Arial" w:cs="Arial" w:eastAsia="Arial" w:hAnsi="Arial"/>
         </w:rPr>
-        <w:t xml:space="preserve"> Among infected cells, cell-line populations also showed a more saturated, near-binary titer distribution than the graded titer observed in embryos, suggesting that whatever process establishes a stable cell line may also fix infection status into an all-or-nothing state rather than preserving the continuous, spatially graded titer present in the embryo. </w:t>
+        <w:t xml:space="preserve"> </w:t>
+      </w:r>
+      <w:r>
+        <w:rPr>
+          <w:rFonts w:ascii="Arial" w:cs="Arial" w:eastAsia="Arial" w:hAnsi="Arial"/>
+          <w:b/>
+          <w:bCs/>
+        </w:rPr>
+        <w:t xml:space="preserve">The two infected cell lines were infected in every cell and near saturation (median titer among infected cells 0.95–0.97; 87–93% of cells at or above 0.9), whereas embryos showed graded titers (median 0.67–0.88; 2–41% at or above 0.9; Table S11). With two infected cell lines this difference cannot reach significance (the smallest attainable exact p is 0.13), so we treat it as descriptive; it suggests that establishing a stable cell line may fix infection into an all-or-nothing state rather than preserving the graded titer present in the embryo.</w:t>
+      </w:r>
+      <w:r>
+        <w:rPr>
+          <w:rFonts w:ascii="Arial" w:cs="Arial" w:eastAsia="Arial" w:hAnsi="Arial"/>
+        </w:rPr>
+        <w:t xml:space="preserve"> </w:t>
       </w:r>
       <w:r>
         <w:rPr>
@@ -4893,6 +5731,184 @@
           <w:szCs w:val="18"/>
         </w:rPr>
         <w:t xml:space="preserve">Figure S1. Pseudobulk differential expression between Dsim6B-wMel and Dsim6B (two libraries each; PyDESeq2, design ~ infection). Red, higher in Dsim6B-wMel; blue, higher in Dsim6B; adjusted p &lt; 0.05.</w:t>
+      </w:r>
+    </w:p>
+    <w:p>
+      <w:pPr>
+        <w:pStyle w:val="Heading1"/>
+      </w:pPr>
+      <w:r>
+        <w:rPr>
+          <w:rFonts w:ascii="Arial" w:cs="Arial" w:eastAsia="Arial" w:hAnsi="Arial"/>
+          <w:b/>
+          <w:bCs/>
+        </w:rPr>
+        <w:t xml:space="preserve">Supplementary tables</w:t>
+      </w:r>
+    </w:p>
+    <w:p>
+      <w:pPr>
+        <w:spacing w:after="80"/>
+      </w:pPr>
+      <w:r>
+        <w:rPr>
+          <w:rFonts w:ascii="Arial" w:cs="Arial" w:eastAsia="Arial" w:hAnsi="Arial"/>
+          <w:b/>
+          <w:bCs/>
+          <w:sz w:val="18"/>
+          <w:szCs w:val="18"/>
+        </w:rPr>
+        <w:t xml:space="preserve">Table S1. Sample summary: cells, median UMIs, stage, lineage, Wolbachia UMI fraction, and same-stage nearest-neighbor fraction (results/pseudotime/infection/sample_summary.csv; results/pseudotime/*/figures/knn_stage_mixing_*.csv).</w:t>
+      </w:r>
+    </w:p>
+    <w:p>
+      <w:pPr>
+        <w:spacing w:after="80"/>
+      </w:pPr>
+      <w:r>
+        <w:rPr>
+          <w:rFonts w:ascii="Arial" w:cs="Arial" w:eastAsia="Arial" w:hAnsi="Arial"/>
+          <w:b/>
+          <w:bCs/>
+          <w:sz w:val="18"/>
+          <w:szCs w:val="18"/>
+        </w:rPr>
+        <w:t xml:space="preserve">Table S2. Pseudobulk differential expression for every contrast, with per-lineage log2 fold changes and direction agreement (results/pseudotime/de/de_*.csv, lineage_consistency_*.csv).</w:t>
+      </w:r>
+    </w:p>
+    <w:p>
+      <w:pPr>
+        <w:spacing w:after="80"/>
+      </w:pPr>
+      <w:r>
+        <w:rPr>
+          <w:rFonts w:ascii="Arial" w:cs="Arial" w:eastAsia="Arial" w:hAnsi="Arial"/>
+          <w:b/>
+          <w:bCs/>
+          <w:sz w:val="18"/>
+          <w:szCs w:val="18"/>
+        </w:rPr>
+        <w:t xml:space="preserve">Table S3. GSEA results for every contrast (results/pseudotime/de/gsea_*.csv).</w:t>
+      </w:r>
+    </w:p>
+    <w:p>
+      <w:pPr>
+        <w:spacing w:after="80"/>
+      </w:pPr>
+      <w:r>
+        <w:rPr>
+          <w:rFonts w:ascii="Arial" w:cs="Arial" w:eastAsia="Arial" w:hAnsi="Arial"/>
+          <w:b/>
+          <w:bCs/>
+          <w:sz w:val="18"/>
+          <w:szCs w:val="18"/>
+        </w:rPr>
+        <w:t xml:space="preserve">Table S4. Marker-state and flag fractions per sample, and stage tests (results/pseudotime/cell_states/state_fractions_by_sample.csv, composition_tests.csv).</w:t>
+      </w:r>
+    </w:p>
+    <w:p>
+      <w:pPr>
+        <w:spacing w:after="80"/>
+      </w:pPr>
+      <w:r>
+        <w:rPr>
+          <w:rFonts w:ascii="Arial" w:cs="Arial" w:eastAsia="Arial" w:hAnsi="Arial"/>
+          <w:b/>
+          <w:bCs/>
+          <w:sz w:val="18"/>
+          <w:szCs w:val="18"/>
+        </w:rPr>
+        <w:t xml:space="preserve">Table S5. Rank test for primary-cell-line subsets (results/pseudotime/cell_states/precursor_rank_test.csv).</w:t>
+      </w:r>
+    </w:p>
+    <w:p>
+      <w:pPr>
+        <w:spacing w:after="80"/>
+      </w:pPr>
+      <w:r>
+        <w:rPr>
+          <w:rFonts w:ascii="Arial" w:cs="Arial" w:eastAsia="Arial" w:hAnsi="Arial"/>
+          <w:b/>
+          <w:bCs/>
+          <w:sz w:val="18"/>
+          <w:szCs w:val="18"/>
+        </w:rPr>
+        <w:t xml:space="preserve">Table S6. Pvr, Pvf2, MAPK-target, and proliferation correlations per sample (results/pseudotime/cell_states/pvr_mapk_by_sample.csv).</w:t>
+      </w:r>
+    </w:p>
+    <w:p>
+      <w:pPr>
+        <w:spacing w:after="80"/>
+      </w:pPr>
+      <w:r>
+        <w:rPr>
+          <w:rFonts w:ascii="Arial" w:cs="Arial" w:eastAsia="Arial" w:hAnsi="Arial"/>
+          <w:b/>
+          <w:bCs/>
+          <w:sz w:val="18"/>
+          <w:szCs w:val="18"/>
+        </w:rPr>
+        <w:t xml:space="preserve">Table S7. Polycomb marking per gene, trend test, and GO enrichment of switched-off genes (results/pseudotime/silencing/gene_marks.csv, h3k27me3_trend.csv, go_off_*.csv; results/pseudotime/mechanisms/genes_off_in_all_lines.csv).</w:t>
+      </w:r>
+    </w:p>
+    <w:p>
+      <w:pPr>
+        <w:spacing w:after="80"/>
+      </w:pPr>
+      <w:r>
+        <w:rPr>
+          <w:rFonts w:ascii="Arial" w:cs="Arial" w:eastAsia="Arial" w:hAnsi="Arial"/>
+          <w:b/>
+          <w:bCs/>
+          <w:sz w:val="18"/>
+          <w:szCs w:val="18"/>
+        </w:rPr>
+        <w:t xml:space="preserve">Table S8. Dsim6B-wMel versus Dsim6B differential expression and GSEA (results/pseudotime/infection_de/).</w:t>
+      </w:r>
+    </w:p>
+    <w:p>
+      <w:pPr>
+        <w:spacing w:after="80"/>
+      </w:pPr>
+      <w:r>
+        <w:rPr>
+          <w:rFonts w:ascii="Arial" w:cs="Arial" w:eastAsia="Arial" w:hAnsi="Arial"/>
+          <w:b/>
+          <w:bCs/>
+          <w:sz w:val="18"/>
+          <w:szCs w:val="18"/>
+        </w:rPr>
+        <w:t xml:space="preserve">Table S9. Shannon diversity and tissue-specificity tests (results/atlas_stats/diversity_tests.csv, tissue_specificity*.csv).</w:t>
+      </w:r>
+    </w:p>
+    <w:p>
+      <w:pPr>
+        <w:spacing w:after="80"/>
+      </w:pPr>
+      <w:r>
+        <w:rPr>
+          <w:rFonts w:ascii="Arial" w:cs="Arial" w:eastAsia="Arial" w:hAnsi="Arial"/>
+          <w:b/>
+          <w:bCs/>
+          <w:sz w:val="18"/>
+          <w:szCs w:val="18"/>
+        </w:rPr>
+        <w:t xml:space="preserve">Table S10. Pseudobulk correlation permutation test and parental-embryo ranks (results/atlas_stats/correlation_permutation.csv, parent_rank.csv).</w:t>
+      </w:r>
+    </w:p>
+    <w:p>
+      <w:pPr>
+        <w:spacing w:after="80"/>
+      </w:pPr>
+      <w:r>
+        <w:rPr>
+          <w:rFonts w:ascii="Arial" w:cs="Arial" w:eastAsia="Arial" w:hAnsi="Arial"/>
+          <w:b/>
+          <w:bCs/>
+          <w:sz w:val="18"/>
+          <w:szCs w:val="18"/>
+        </w:rPr>
+        <w:t xml:space="preserve">Table S11. Wolbachia titer among infected cells by condition (results/atlas_stats/titer_by_condition.csv, titer_tests.csv).</w:t>
       </w:r>
     </w:p>
     <w:p>

</xml_diff>